<commit_message>
pp-salygos: sutarčių šablonų teisės nuorodų patikra; prekių SS 14.1 papildyta kaip paslaugų (sutarčių planas 6.1)
- sutarciu-nuorodos.js: teisesNuorodos() ir zemelapioTekstai() - VPĮ / PĮ straipsnių,
  dalių ir priedų nuorodos (su grandine), kiti įvardyti aktai, angliški atitikmenys,
  ir išskleidžiamų sąrašų variantai
- zemelapiai/sutarciu-teises-nuorodos.json: 67 nuorodos, patikrintos e-tar ir EUR-Lex
  2026-10-09, su aktais ir šaltiniais; radiniai T1, T2 (palikta kaip VPT tipinėse
  sąlygose, klausimai LITGRID) ir T3
- T3 (naudotojo sprendimas): prekių SS 14.1 p. (LT ir LT/EN) - eilutė „... punktuose
  minima sąvoka „VPĮ“ keičiama į sąvoką „VPĮ / PĮ““ ir BS 16.4, 17.7 p. nauja redakcija;
  iki tol PĮ pirkime 12 prekių BS punktų likdavo tik su VPĮ; registre - nauja redakcija
- testai (195): kiekviena šablonų nuoroda sąraše ir naudojama, ištraukimo taisyklės
  (3 mutacijos pagaunamos), abiejų šeimų BS punktai su VPĮ - SS 14.1 p.

Co-Authored-By: Claude Opus 5.5 <noreply@anthropic.com>
</commit_message>
<xml_diff>
--- a/PP-salygos/templates/sutartys/PREKES_LTEN_SS.docx
+++ b/PP-salygos/templates/sutartys/PREKES_LTEN_SS.docx
@@ -5986,7 +5986,7 @@
                 <w:showingPlcHdr/>
                 <w:dropDownList>
                   <w:listItem w:value="Choose an item."/>
-                  <w:listItem w:displayText="in the event of a change in the price level:" w:value="in the event of a change in the price level:"/>
+                  <w:listItem w:displayText="5.3.1.2. in the event of a change in the price level:" w:value="5.3.1.2. in the event of a change in the price level:"/>
                   <w:listItem w:displayText="This paragraph and subparagraphs 5.3.1.2.1 - 5.3.1.2.10 do not apply." w:value="This paragraph and subparagraphs 5.3.1.2.1 - 5.3.1.2.10 do not apply."/>
                 </w:dropDownList>
               </w:sdtPr>
@@ -18756,6 +18756,27 @@
                 <w:sz w:val="20"/>
                 <w14:ligatures w14:val="standardContextual"/>
               </w:rPr>
+              <w:t xml:space="preserve">1.1.1.9., 1.1.1.18., 1.2.2., 1.2.6., 3.3.1., 3.3.2., 7.4.1.2., 10.3., 20.1., 21.4. punktuose minima sąvoka „VPĮ“ keičiama į sąvoką „VPĮ / PĮ“;</w:t>
+            </w:r>
+          </w:p>
+          <w:p>
+            <w:pPr>
+              <w:spacing w:line="276" w:lineRule="auto"/>
+              <w:jc w:val="both"/>
+              <w:rPr>
+                <w:rFonts w:ascii="Arial" w:eastAsiaTheme="minorHAnsi" w:hAnsi="Arial" w:cs="Arial"/>
+                <w:kern w:val="2"/>
+                <w:sz w:val="20"/>
+                <w14:ligatures w14:val="standardContextual"/>
+              </w:rPr>
+            </w:pPr>
+            <w:r>
+              <w:rPr>
+                <w:rFonts w:ascii="Arial" w:eastAsiaTheme="minorHAnsi" w:hAnsi="Arial" w:cs="Arial"/>
+                <w:kern w:val="2"/>
+                <w:sz w:val="20"/>
+                <w14:ligatures w14:val="standardContextual"/>
+              </w:rPr>
               <w:t>„10.6. Bankas (draudimo bendrovė) neturi teisės reikalauti, kad Pirkėjas pagrįstų savo reikalavimą. Pirkėjas pranešime bankui (draudimo bendrovei) nurodo, kad Sutarties įvykdymo užtikrinimo suma jam priklauso dėl to, kad Tiekėjas iš dalies ar visiškai neįvykdė Sutarties ir (arba) ji buvo nutraukta dėl Tiekėjo kaltės. Pirkėjas neįsipareigoja įrodyti realiai patirtų nuostolių ir Tiekėjas, pasirašydamas Sutartį ir pateikdamas Sutarties įvykdymo užtikrinimą, patvirtina, kad Sutarties įvykdymo užtikrinimo suma laikytina minimaliais neįrodinėjamais Pirkėjo nuostoliais.“;</w:t>
             </w:r>
           </w:p>
@@ -18778,6 +18799,48 @@
                 <w14:ligatures w14:val="standardContextual"/>
               </w:rPr>
               <w:t>„10.16.3. jei dėl bet kokių Tiekėjo veiksmų (veikimo ar neveikimo) Pirkėjas patyrė nuostolius (tiesioginius nuostolius, delspinigius ir (arba) baudas (jei netesybos numatytos Sutartyje)).“;</w:t>
+            </w:r>
+          </w:p>
+          <w:p>
+            <w:pPr>
+              <w:spacing w:line="276" w:lineRule="auto"/>
+              <w:jc w:val="both"/>
+              <w:rPr>
+                <w:rFonts w:ascii="Arial" w:eastAsiaTheme="minorHAnsi" w:hAnsi="Arial" w:cs="Arial"/>
+                <w:kern w:val="2"/>
+                <w:sz w:val="20"/>
+                <w14:ligatures w14:val="standardContextual"/>
+              </w:rPr>
+            </w:pPr>
+            <w:r>
+              <w:rPr>
+                <w:rFonts w:ascii="Arial" w:eastAsiaTheme="minorHAnsi" w:hAnsi="Arial" w:cs="Arial"/>
+                <w:kern w:val="2"/>
+                <w:sz w:val="20"/>
+                <w14:ligatures w14:val="standardContextual"/>
+              </w:rPr>
+              <w:t xml:space="preserve">„16.4. Tiekėjas įsipareigoja vykdant Sutartį laikytis aplinkos apsaugos, socialinės ir darbo teisės įpareigojimų, nustatytų Europos Sąjungos ir nacionalinėje teisėje, kolektyvinėse sutartyse ir VPĮ 5 priede / PĮ 7 priede nurodytose tarptautinėse konvencijose.“;</w:t>
+            </w:r>
+          </w:p>
+          <w:p>
+            <w:pPr>
+              <w:spacing w:line="276" w:lineRule="auto"/>
+              <w:jc w:val="both"/>
+              <w:rPr>
+                <w:rFonts w:ascii="Arial" w:eastAsiaTheme="minorHAnsi" w:hAnsi="Arial" w:cs="Arial"/>
+                <w:kern w:val="2"/>
+                <w:sz w:val="20"/>
+                <w14:ligatures w14:val="standardContextual"/>
+              </w:rPr>
+            </w:pPr>
+            <w:r>
+              <w:rPr>
+                <w:rFonts w:ascii="Arial" w:eastAsiaTheme="minorHAnsi" w:hAnsi="Arial" w:cs="Arial"/>
+                <w:kern w:val="2"/>
+                <w:sz w:val="20"/>
+                <w14:ligatures w14:val="standardContextual"/>
+              </w:rPr>
+              <w:t xml:space="preserve">„17.7. Jeigu Sutartis nutraukiama dėl esminio Sutarties pažeidimo pagal Bendrųjų sąlygų 22.2.1 papunktį ir (ar) Tiekėjas esminę Sutarties sąlygą, nurodytą Specialiųjų sąlygų 10 skyriuje, vykdo su dideliais ar nuolatiniais trūkumais, Tiekėjas įtraukiamas į nepatikimų tiekėjų sąrašą VPĮ 91 straipsnyje / PĮ 99 straipsnyje nustatyta tvarka. Atvejai, kuomet laikoma, kad esminė Sutarties sąlyga vykdoma su dideliais arba nuolatiniai trūkumais nurodyti Specialiųjų sąlygų 10 skyriuje. Esminės Sutarties sąlygos vykdymas su dideliais arba nuolatiniais trūkumais gali būti pripažįstamas ir kitais, Specialiosiose sąlygose nenurodytais, atvejais, įvertinus konkrečias esminės Sutarties sąlygos netinkamo vykdymo aplinkybes.“;</w:t>
             </w:r>
           </w:p>
           <w:p>
@@ -19070,6 +19133,27 @@
                 <w:sz w:val="20"/>
                 <w:lang w:val="en-GB"/>
               </w:rPr>
+              <w:t xml:space="preserve">In paragraphs 1.1.1.9, 1.1.1.18, 1.2.2, 1.2.6, 3.3.1, 3.3.2, 7.4.1.2, 10.3, 20.1 and 21.4, the term “LPP” shall be replaced by the term “LPP / LP”;</w:t>
+            </w:r>
+          </w:p>
+          <w:p>
+            <w:pPr>
+              <w:spacing w:line="276" w:lineRule="auto"/>
+              <w:jc w:val="both"/>
+              <w:rPr>
+                <w:rFonts w:ascii="Arial" w:eastAsiaTheme="minorHAnsi" w:hAnsi="Arial" w:cs="Arial"/>
+                <w:kern w:val="2"/>
+                <w:sz w:val="20"/>
+                <w14:ligatures w14:val="standardContextual"/>
+              </w:rPr>
+            </w:pPr>
+            <w:r>
+              <w:rPr>
+                <w:rFonts w:ascii="Arial" w:eastAsiaTheme="minorHAnsi" w:hAnsi="Arial" w:cs="Arial"/>
+                <w:kern w:val="2"/>
+                <w:sz w:val="20"/>
+                <w:lang w:val="en-GB"/>
+              </w:rPr>
               <w:t xml:space="preserve">“10.6. The bank (insurance company) shall not be entitled to require the Buyer to substantiate its claim. In its notice to the bank (insurance company), the Buyer shall state that the amount of the Contract Performance Security is due to it because the Supplier has failed to perform the Contract in part or in full and/or the Contract has been terminated through the fault of the Supplier. The Buyer shall not be obliged to prove any losses actually incurred, and the Supplier, by signing the Contract and providing the Contract Performance Security, confirms that the amount of the Contract Performance Security shall be deemed to be the Buyer’s minimum losses which do not need to be proved.”;</w:t>
             </w:r>
           </w:p>
@@ -19092,6 +19176,48 @@
                 <w:lang w:val="en-GB"/>
               </w:rPr>
               <w:t xml:space="preserve">“10.16.3. if the Buyer has suffered losses (direct losses, default interest and/or penalties (where liquidated damages are provided for in the Contract)) as a result of any action (act or omission) of the Supplier.”;</w:t>
+            </w:r>
+          </w:p>
+          <w:p>
+            <w:pPr>
+              <w:spacing w:line="276" w:lineRule="auto"/>
+              <w:jc w:val="both"/>
+              <w:rPr>
+                <w:rFonts w:ascii="Arial" w:eastAsiaTheme="minorHAnsi" w:hAnsi="Arial" w:cs="Arial"/>
+                <w:kern w:val="2"/>
+                <w:sz w:val="20"/>
+                <w14:ligatures w14:val="standardContextual"/>
+              </w:rPr>
+            </w:pPr>
+            <w:r>
+              <w:rPr>
+                <w:rFonts w:ascii="Arial" w:eastAsiaTheme="minorHAnsi" w:hAnsi="Arial" w:cs="Arial"/>
+                <w:kern w:val="2"/>
+                <w:sz w:val="20"/>
+                <w:lang w:val="en-GB"/>
+              </w:rPr>
+              <w:t xml:space="preserve">“16.4. In performing the Contract, the Supplier undertakes to comply with the environmental, social and labour law obligations established by European Union and national law, collective agreements and the international conventions listed in Annex 5 to the LPP / Annex 7 to the LP.”;</w:t>
+            </w:r>
+          </w:p>
+          <w:p>
+            <w:pPr>
+              <w:spacing w:line="276" w:lineRule="auto"/>
+              <w:jc w:val="both"/>
+              <w:rPr>
+                <w:rFonts w:ascii="Arial" w:eastAsiaTheme="minorHAnsi" w:hAnsi="Arial" w:cs="Arial"/>
+                <w:kern w:val="2"/>
+                <w:sz w:val="20"/>
+                <w14:ligatures w14:val="standardContextual"/>
+              </w:rPr>
+            </w:pPr>
+            <w:r>
+              <w:rPr>
+                <w:rFonts w:ascii="Arial" w:eastAsiaTheme="minorHAnsi" w:hAnsi="Arial" w:cs="Arial"/>
+                <w:kern w:val="2"/>
+                <w:sz w:val="20"/>
+                <w:lang w:val="en-GB"/>
+              </w:rPr>
+              <w:t xml:space="preserve">“17.7. If the Contract is terminated for a material breach of the Contract under subparagraph 22.2.1 of the General Terms and Conditions and/or the Supplier performs an essential term of the Contract specified in Section 10 of the Special Terms and Conditions with serious or repeated deficiencies, the Supplier shall be included in the list of unreliable suppliers in accordance with the procedure laid down in Article 91 of the LPP / Article 99 of the LP. The cases in which an essential term of the Contract is deemed to be performed with serious or repeated deficiencies are specified in Section 10 of the Special Terms and Conditions. An essential term of the Contract may also be found to be performed with serious or repeated deficiencies in other cases not specified in the Special Terms and Conditions, having regard to the specific circumstances of the improper performance of the essential term of the Contract.”;</w:t>
             </w:r>
           </w:p>
           <w:p>

</xml_diff>